<commit_message>
Beri murid layar avatar sendiri dan guru antrean tinjau laporannya
Layar murid menolak berkas bukan-foto sebelum diunggah supaya anak tidak
menunggu sia-sia, sementara guru mendapat antrean berisi gambar yang dilaporkan
beserta alasan tiap pelapor. Dokumentasi slice 08 (penjelasan fitur, cara demo,
laporan pengujian) dan log mentah sesi ikut disegarkan.

🤖 Generated with Codebuff
Co-Authored-By: Codebuff <noreply@codebuff.com>
</commit_message>
<xml_diff>
--- a/docs/word/catatan-demo.docx
+++ b/docs/word/catatan-demo.docx
@@ -1538,6 +1538,223 @@
     <w:p>
       <w:r>
         <w:t>Perbaikan penuh menunggu keputusan produk (pola "kami sudah kirim email ke alamat itu" tanpa auto-login).</w:t>
+      </w:r>
+    </w:p>
+    <w:p>
+      <w:r/>
+    </w:p>
+    <w:p>
+      <w:pPr>
+        <w:pStyle w:val="Heading2"/>
+      </w:pPr>
+      <w:r>
+        <w:t>Demo Slice 08 — Materi Berblok, Berkas Aman, dan Avatar Termoderasi</w:t>
+      </w:r>
+    </w:p>
+    <w:p>
+      <w:r/>
+    </w:p>
+    <w:p>
+      <w:pPr>
+        <w:pStyle w:val="Heading3"/>
+      </w:pPr>
+      <w:r>
+        <w:t>Langkah demo (guru) — menyusun materi berblok</w:t>
+      </w:r>
+    </w:p>
+    <w:p>
+      <w:r>
+        <w:t>1. Masuk sebagai guru (`http://localhost:5173`, `admin@sekolah.test`), buka **Materi** → buat materi</w:t>
+      </w:r>
+    </w:p>
+    <w:p>
+      <w:r>
+        <w:t xml:space="preserve">   kelas 3A dengan tema yang sudah ada.</w:t>
+      </w:r>
+    </w:p>
+    <w:p>
+      <w:r>
+        <w:t>2. Susun blok: **teks** → **media** (unggah sebuah gambar; sebutkan bahwa berkas yang tidak dikenali akan</w:t>
+      </w:r>
+    </w:p>
+    <w:p>
+      <w:r>
+        <w:t xml:space="preserve">   dipaksa unduh sebagai `.upload`) → **kuis** (pilih kuis bersoal objektif) → **teks** penutup.</w:t>
+      </w:r>
+    </w:p>
+    <w:p>
+      <w:r>
+        <w:t xml:space="preserve">   Tandai blok penting sebagai **wajib**.</w:t>
+      </w:r>
+    </w:p>
+    <w:p>
+      <w:r>
+        <w:t>3. Terbitkan materi, lalu tunjukkan **laporan tema** materi itu setelah murid mengerjakan latihannya.</w:t>
+      </w:r>
+    </w:p>
+    <w:p>
+      <w:r>
+        <w:t>4. Ajukan satu blok kuis bersoal uraian untuk menunjukkan server **menolaknya** (latihan anak harus dinilai pasti).</w:t>
+      </w:r>
+    </w:p>
+    <w:p>
+      <w:r/>
+    </w:p>
+    <w:p>
+      <w:pPr>
+        <w:pStyle w:val="Heading3"/>
+      </w:pPr>
+      <w:r>
+        <w:t>Langkah demo (murid) — menempuh materi</w:t>
+      </w:r>
+    </w:p>
+    <w:p>
+      <w:r>
+        <w:t>1. Masuk sebagai murid kelas 3A, buka **Materi** → pilih materi tadi.</w:t>
+      </w:r>
+    </w:p>
+    <w:p>
+      <w:r>
+        <w:t>2. Tunjukkan urutan ditegakkan **server**: mencoba membuka blok kuis sebelum blok wajib selesai ditolak.</w:t>
+      </w:r>
+    </w:p>
+    <w:p>
+      <w:r>
+        <w:t>3. Buka blok teks → tandai selesai → blok kuis membuka latihan; soal memakai renderer yang sama seperti</w:t>
+      </w:r>
+    </w:p>
+    <w:p>
+      <w:r>
+        <w:t xml:space="preserve">   ulangan, dan **tidak ada kunci jawaban** di respons mana pun.</w:t>
+      </w:r>
+    </w:p>
+    <w:p>
+      <w:r>
+        <w:t>4. Kumpulkan latihan, tandai blok selesai. Tekankan: nilainya masuk laporan tema, **bukan** ranking.</w:t>
+      </w:r>
+    </w:p>
+    <w:p>
+      <w:r/>
+    </w:p>
+    <w:p>
+      <w:pPr>
+        <w:pStyle w:val="Heading3"/>
+      </w:pPr>
+      <w:r>
+        <w:t>Langkah demo (murid) — avatar dan lapor</w:t>
+      </w:r>
+    </w:p>
+    <w:p>
+      <w:r>
+        <w:t>1. Buka **Avatar** → unggah sebuah foto. Tunjukkan gambar otomatis dikecilkan (256×256) dan avatar bawaan</w:t>
+      </w:r>
+    </w:p>
+    <w:p>
+      <w:r>
+        <w:t xml:space="preserve">   memakai **inisial nama** sebelum ada foto.</w:t>
+      </w:r>
+    </w:p>
+    <w:p>
+      <w:r>
+        <w:t>2. Coba unggah berkas SVG yang dinamai `.png` → ditolak dengan pesan jelas (SVG bisa memuat skrip).</w:t>
+      </w:r>
+    </w:p>
+    <w:p>
+      <w:r>
+        <w:t>3. Dari akun murid lain, tekan **Lapor** pada avatar teman. Ulangi dari murid yang sama → hitungan laporan</w:t>
+      </w:r>
+    </w:p>
+    <w:p>
+      <w:r>
+        <w:t xml:space="preserve">   **tidak** bertambah (satu laporan per murid per avatar).</w:t>
+      </w:r>
+    </w:p>
+    <w:p>
+      <w:r>
+        <w:t>4. Setelah **tiga murid berbeda** melapor, avatar hilang dari daftar teman, tetapi **pemiliknya masih</w:t>
+      </w:r>
+    </w:p>
+    <w:p>
+      <w:r>
+        <w:t xml:space="preserve">   melihatnya sendiri**; sedangkan guru melihatnya di **Moderasi Avatar** beserta alasan tiap pelapor.</w:t>
+      </w:r>
+    </w:p>
+    <w:p>
+      <w:r>
+        <w:t>5. Guru menekan **Pulihkan** (dengan catatan alasan) → avatar kembali tampil dan laporan lama jadi tidak valid;</w:t>
+      </w:r>
+    </w:p>
+    <w:p>
+      <w:r>
+        <w:t xml:space="preserve">   lalu tunjukkan **Hapus avatar** pada kasus lain beserta catatan jejaknya di audit.</w:t>
+      </w:r>
+    </w:p>
+    <w:p>
+      <w:r/>
+    </w:p>
+    <w:p>
+      <w:pPr>
+        <w:pStyle w:val="Heading3"/>
+      </w:pPr>
+      <w:r>
+        <w:t>Bukti lewat API (curl)</w:t>
+      </w:r>
+    </w:p>
+    <w:p>
+      <w:r/>
+    </w:p>
+    <w:p>
+      <w:r>
+        <w:t># Unggah avatar (jalur uji non-browser: base64) — server tetap mengencode ulang ke JPEG 256x256</w:t>
+      </w:r>
+    </w:p>
+    <w:p>
+      <w:r>
+        <w:t>curl -s -X POST http://localhost:8000/api/v1/avatar \</w:t>
+      </w:r>
+    </w:p>
+    <w:p>
+      <w:r>
+        <w:t xml:space="preserve">  -H 'Accept: application/json' -b cookie.txt \</w:t>
+      </w:r>
+    </w:p>
+    <w:p>
+      <w:r>
+        <w:t xml:space="preserve">  -d 'isi_base64=&lt;base64 gambar&gt;' | jq '{id, status, mime, lebar, tinggi, url}'</w:t>
+      </w:r>
+    </w:p>
+    <w:p>
+      <w:r/>
+    </w:p>
+    <w:p>
+      <w:pPr>
+        <w:pStyle w:val="Heading3"/>
+      </w:pPr>
+      <w:r>
+        <w:t>Bukti otomatis</w:t>
+      </w:r>
+    </w:p>
+    <w:p>
+      <w:r/>
+    </w:p>
+    <w:p>
+      <w:r>
+        <w:t>`Slice08AvatarTest` (10 test / 104 assertion) dan `Slice08Test` (8 test / 108 assertion) lulus, termasuk</w:t>
+      </w:r>
+    </w:p>
+    <w:p>
+      <w:r>
+        <w:t>penolakan SVG, ambang 3 laporan unik, dan jejak audit pulihkan/hapus. **Catatan jujur:** smoke UI Chrome</w:t>
+      </w:r>
+    </w:p>
+    <w:p>
+      <w:r>
+        <w:t>(CDP) untuk slice 08 **belum** dijalankan, jadi bukti slice ini masih sebatas test otomatis — rinciannya di</w:t>
+      </w:r>
+    </w:p>
+    <w:p>
+      <w:r>
+        <w:t>`docs/laporan-pengujian.md` bagian A.12.</w:t>
       </w:r>
     </w:p>
     <w:sectPr>

</xml_diff>

<commit_message>
Beri guru usulan nilai AI tanpa menyerahkan keputusan penilaian
Guru kelas 3 yang mengoreksi 30 uraian bisa mulai dari angka usulan, tetapi
nilai resmi tetap hanya berubah lewat koreksi bertoken. Saran disimpan di kolom
terpisah, skornya dipotong ke rentang soal, alasan mentahnya tidak pernah
sampai ke murid, dan kunci API hanya hidup di server. AI gagal atau timeout
bukan alasan memberi nilai nol diam-diam: jawabannya tetap menunggu tinjauan.

🤖 Generated with Codebuff
Co-Authored-By: Codebuff <noreply@codebuff.com>
</commit_message>
<xml_diff>
--- a/docs/word/catatan-demo.docx
+++ b/docs/word/catatan-demo.docx
@@ -1755,6 +1755,203 @@
     <w:p>
       <w:r>
         <w:t>`docs/laporan-pengujian.md` bagian A.12.</w:t>
+      </w:r>
+    </w:p>
+    <w:p>
+      <w:r/>
+    </w:p>
+    <w:p>
+      <w:pPr>
+        <w:pStyle w:val="Heading2"/>
+      </w:pPr>
+      <w:r>
+        <w:t>Demo Slice 09 — Lampiran Jawaban dan Saran AI</w:t>
+      </w:r>
+    </w:p>
+    <w:p>
+      <w:r/>
+    </w:p>
+    <w:p>
+      <w:r>
+        <w:t>Siapkan dulu satu kuis berisi satu soal **uraian** dengan kata kunci, sudah diterbitkan untuk kelas 3A.</w:t>
+      </w:r>
+    </w:p>
+    <w:p>
+      <w:r/>
+    </w:p>
+    <w:p>
+      <w:pPr>
+        <w:pStyle w:val="Heading3"/>
+      </w:pPr>
+      <w:r>
+        <w:t>Langkah demo (murid) — menjawab tanpa banyak mengetik</w:t>
+      </w:r>
+    </w:p>
+    <w:p>
+      <w:r>
+        <w:t>1. Masuk sebagai murid, buka kuis, buka soal uraiannya. Di bawah soal muncul panel **Lampiran jawaban**.</w:t>
+      </w:r>
+    </w:p>
+    <w:p>
+      <w:r>
+        <w:t>2. **Gambar kanvas**: menulis atau menggambar sesuatu dengan mouse/jari, lalu simpan. Sebutkan bahwa server</w:t>
+      </w:r>
+    </w:p>
+    <w:p>
+      <w:r>
+        <w:t xml:space="preserve">   menerima potongan 1 MiB per kiriman, jadi jaringan lambat pun tidak menggagalkan jawaban.</w:t>
+      </w:r>
+    </w:p>
+    <w:p>
+      <w:r>
+        <w:t>3. **Rekam diri**: tunjukkan bahwa bagian ini muncul hanya bila sekolah menyalakan `rekam_diri`</w:t>
+      </w:r>
+    </w:p>
+    <w:p>
+      <w:r>
+        <w:t xml:space="preserve">   (bawaan **mati**), lalu rekam beberapa detik dengan centang izin. Lewat dari 60 detik → ditolak.</w:t>
+      </w:r>
+    </w:p>
+    <w:p>
+      <w:r>
+        <w:t>4. Unggah satu **berkas** (mis. foto pekerjaan di buku) → muncul di daftar lampiran, bisa dibuang lagi.</w:t>
+      </w:r>
+    </w:p>
+    <w:p>
+      <w:r>
+        <w:t>5. Kumpulkan ulangan **sebelum** waktunya habis; setelah waktu habis, server menolak lampiran baru.</w:t>
+      </w:r>
+    </w:p>
+    <w:p>
+      <w:r/>
+    </w:p>
+    <w:p>
+      <w:pPr>
+        <w:pStyle w:val="Heading3"/>
+      </w:pPr>
+      <w:r>
+        <w:t>Langkah demo (guru) — saran AI lalu keputusan guru</w:t>
+      </w:r>
+    </w:p>
+    <w:p>
+      <w:r>
+        <w:t>1. Nyalakan AI di server (sekali saja, di `.env`): `AI_PENILAIAN_AKTIF=true` dan `AI_PENILAIAN_KUNCI=...`.</w:t>
+      </w:r>
+    </w:p>
+    <w:p>
+      <w:r>
+        <w:t>2. Buka **Koreksi** untuk kuis tadi. Tunjukkan catatan "Saran AI tersedia sebagai bahan pertimbangan" dan</w:t>
+      </w:r>
+    </w:p>
+    <w:p>
+      <w:r>
+        <w:t xml:space="preserve">   tombol **Minta saran AI** pada baris jawaban.</w:t>
+      </w:r>
+    </w:p>
+    <w:p>
+      <w:r>
+        <w:t>3. Tekan **Minta saran AI** → muncul usulan angka + **Catatan AI** (alasan singkat). Tekankan: nilai</w:t>
+      </w:r>
+    </w:p>
+    <w:p>
+      <w:r>
+        <w:t xml:space="preserve">   `skor_sekarang` **tidak** ikut berubah walau ada saran.</w:t>
+      </w:r>
+    </w:p>
+    <w:p>
+      <w:r>
+        <w:t>4. Tekan **Pakai saran AI** (mengisi kolom skor), lalu tetap isi **alasan koreksi**, minta **token</w:t>
+      </w:r>
+    </w:p>
+    <w:p>
+      <w:r>
+        <w:t xml:space="preserve">   konfirmasi**, dan simpan. Barulah nilai resmi berubah, dan jejaknya masuk audit.</w:t>
+      </w:r>
+    </w:p>
+    <w:p>
+      <w:r>
+        <w:t>5. Tunjukkan tombol **Minta saran AI** sekali lagi setelah dikoreksi: nilainya tidak lagi tertimpa saran baru.</w:t>
+      </w:r>
+    </w:p>
+    <w:p>
+      <w:r/>
+    </w:p>
+    <w:p>
+      <w:pPr>
+        <w:pStyle w:val="Heading3"/>
+      </w:pPr>
+      <w:r>
+        <w:t>Bukti lewat API (curl)</w:t>
+      </w:r>
+    </w:p>
+    <w:p>
+      <w:r/>
+    </w:p>
+    <w:p>
+      <w:r>
+        <w:t># Guru meminta saran AI untuk satu attempt (di server, lewat queue)</w:t>
+      </w:r>
+    </w:p>
+    <w:p>
+      <w:r>
+        <w:t>curl -s -X POST http://localhost:8000/api/v1/attempt/&lt;attempt_id&gt;/nilai-ai \</w:t>
+      </w:r>
+    </w:p>
+    <w:p>
+      <w:r>
+        <w:t xml:space="preserve">  -H 'Accept: application/json' -H 'X-XSRF-TOKEN: ...' -b cookie.txt \</w:t>
+      </w:r>
+    </w:p>
+    <w:p>
+      <w:r>
+        <w:t xml:space="preserve">  | jq    # { aktif: true, terantre: 1, message: "Saran AI diminta untuk 1 jawaban." }</w:t>
+      </w:r>
+    </w:p>
+    <w:p>
+      <w:r/>
+    </w:p>
+    <w:p>
+      <w:r>
+        <w:t># Kunci API tidak pernah muncul di respons murid maupun di log server</w:t>
+      </w:r>
+    </w:p>
+    <w:p>
+      <w:r>
+        <w:t>grep -R "AI_PENILAIAN_KUNCI" backend/storage/logs 2&gt;/dev/null || echo 'aman: kunci tidak ada di log'</w:t>
+      </w:r>
+    </w:p>
+    <w:p>
+      <w:r/>
+    </w:p>
+    <w:p>
+      <w:pPr>
+        <w:pStyle w:val="Heading3"/>
+      </w:pPr>
+      <w:r>
+        <w:t>Bukti otomatis</w:t>
+      </w:r>
+    </w:p>
+    <w:p>
+      <w:r/>
+    </w:p>
+    <w:p>
+      <w:r>
+        <w:t>`Slice09UploadTest` (10 test / 98 assertion) dan `Slice09AiTest` (8 test / 83 assertion) lulus, termasuk:</w:t>
+      </w:r>
+    </w:p>
+    <w:p>
+      <w:r>
+        <w:t>skor AI dipotong ke rentang soal, gagal/timeout AI tetap "perlu ditinjau", satu permintaan per ulangan,</w:t>
+      </w:r>
+    </w:p>
+    <w:p>
+      <w:r>
+        <w:t>murid tidak bisa memicu AI, dan hasil murid tidak pernah memuat alasan mentah AI. Rincian di</w:t>
+      </w:r>
+    </w:p>
+    <w:p>
+      <w:r>
+        <w:t>`docs/laporan-pengujian.md` bagian A.13.</w:t>
       </w:r>
     </w:p>
     <w:sectPr>

</xml_diff>

<commit_message>
Beri kuis mode tim satu lembar jawaban bersama yang bisa ditelusuri
Kalau beberapa anak memegang satu perangkat, jawaban bersama gampang berubah
tanpa jejak. Karena itu tiap perubahan disimpan sebagai versi baru beserta
pelakunya, dan satu attempt mewakili satu tim sehingga nilainya otomatis sama
untuk semua anggota tanpa menggandakan baris jawaban. Susunan tim dibekukan
begitu kuis mulai dikerjakan agar tidak ada nilai yang berpindah di tengah jalan.

🤖 Generated with Codebuff
Co-Authored-By: Codebuff <noreply@codebuff.com>
</commit_message>
<xml_diff>
--- a/docs/word/catatan-demo.docx
+++ b/docs/word/catatan-demo.docx
@@ -1936,22 +1936,124 @@
     </w:p>
     <w:p>
       <w:r>
-        <w:t>`Slice09UploadTest` (10 test / 98 assertion) dan `Slice09AiTest` (8 test / 83 assertion) lulus, termasuk:</w:t>
-      </w:r>
-    </w:p>
-    <w:p>
-      <w:r>
-        <w:t>skor AI dipotong ke rentang soal, gagal/timeout AI tetap "perlu ditinjau", satu permintaan per ulangan,</w:t>
-      </w:r>
-    </w:p>
-    <w:p>
-      <w:r>
-        <w:t>murid tidak bisa memicu AI, dan hasil murid tidak pernah memuat alasan mentah AI. Rincian di</w:t>
-      </w:r>
-    </w:p>
-    <w:p>
-      <w:r>
-        <w:t>`docs/laporan-pengujian.md` bagian A.13.</w:t>
+        <w:t>`Slice09UploadTest` (10 test / 98 assertion), `Slice09AiTest` (8 test / 83 assertion), dan `Slice09TimTest`</w:t>
+      </w:r>
+    </w:p>
+    <w:p>
+      <w:r>
+        <w:t>(6 test / 92 assertion) lulus, termasuk: skor AI dipotong ke rentang soal, gagal/timeout AI tetap "perlu</w:t>
+      </w:r>
+    </w:p>
+    <w:p>
+      <w:r>
+        <w:t>ditinjau", satu permintaan per ulangan, murid tidak bisa memicu AI, hasil murid tidak pernah memuat alasan</w:t>
+      </w:r>
+    </w:p>
+    <w:p>
+      <w:r>
+        <w:t>mentah AI, dan satu nilai tim dibagi rata ke anggotanya. Rincian di `docs/laporan-pengujian.md` bagian A.13.</w:t>
+      </w:r>
+    </w:p>
+    <w:p>
+      <w:r/>
+    </w:p>
+    <w:p>
+      <w:pPr>
+        <w:pStyle w:val="Heading3"/>
+      </w:pPr>
+      <w:r>
+        <w:t>Langkah demo (guru) — menyusun tim</w:t>
+      </w:r>
+    </w:p>
+    <w:p>
+      <w:r>
+        <w:t>1. Pada detail kuis, buka **Kelola tim**. Tunjukkan bahwa mode tim masih **mati** (ada peringatan di halaman).</w:t>
+      </w:r>
+    </w:p>
+    <w:p>
+      <w:r>
+        <w:t>2. Isi jumlah tim (mis. 3) lalu tekan **Bagi otomatis** → murid kelas dibagi bergiliran, jadi anak yang</w:t>
+      </w:r>
+    </w:p>
+    <w:p>
+      <w:r>
+        <w:t xml:space="preserve">   berdekatan di daftar tidak menumpuk di satu tim. Tunjukkan juga bisa **Buat tim baru** dan memilih anggota</w:t>
+      </w:r>
+    </w:p>
+    <w:p>
+      <w:r>
+        <w:t xml:space="preserve">   sendiri, serta bahwa murid yang sudah masuk tim lain tidak bisa dipilih dua kali.</w:t>
+      </w:r>
+    </w:p>
+    <w:p>
+      <w:r>
+        <w:t>3. Nyalakan kunci **mode tim** untuk kuis ini di **Pengaturan** (lingkup: kuis).</w:t>
+      </w:r>
+    </w:p>
+    <w:p>
+      <w:r/>
+    </w:p>
+    <w:p>
+      <w:pPr>
+        <w:pStyle w:val="Heading3"/>
+      </w:pPr>
+      <w:r>
+        <w:t>Langkah demo (murid) — satu lembar untuk satu tim</w:t>
+      </w:r>
+    </w:p>
+    <w:p>
+      <w:r>
+        <w:t>1. Dua murid dari tim yang sama membuka kuis. Sebutkan: keduanya masuk ke **lembar yang sama** (bukan dua</w:t>
+      </w:r>
+    </w:p>
+    <w:p>
+      <w:r>
+        <w:t xml:space="preserve">   ulangan), dan panel biru di atas menyebutkan nama tim + rekan setimnya.</w:t>
+      </w:r>
+    </w:p>
+    <w:p>
+      <w:r>
+        <w:t>2. Murid A menjawab soal, lalu murid B membuka layar yang sama → jawabannya sudah terisi, lalu B mengubahnya.</w:t>
+      </w:r>
+    </w:p>
+    <w:p>
+      <w:r>
+        <w:t xml:space="preserve">   Jelaskan: setiap perubahan tersimpan sebagai **versi baru**, jadi kalau ada sengketa "siapa yang mengganti</w:t>
+      </w:r>
+    </w:p>
+    <w:p>
+      <w:r>
+        <w:t xml:space="preserve">   jawaban kami", guru bisa melihat riwayatnya.</w:t>
+      </w:r>
+    </w:p>
+    <w:p>
+      <w:r>
+        <w:t>3. Salah satu anggota menekan **Kumpulkan**; anggota lain membuka **Hasil** dan melihat nilai yang sama.</w:t>
+      </w:r>
+    </w:p>
+    <w:p>
+      <w:r>
+        <w:t>4. Tunjukkan **Badge** keduanya sudah memuat nilai itu (nilai tim dibagi rata), sedangkan anggota tim lain</w:t>
+      </w:r>
+    </w:p>
+    <w:p>
+      <w:r>
+        <w:t xml:space="preserve">   yang belum mengerjakan masih kosong.</w:t>
+      </w:r>
+    </w:p>
+    <w:p>
+      <w:r>
+        <w:t>5. Buka **Peringkat**: kolomnya bernama **Tim**, satu baris per tim, beserta daftar anggotanya.</w:t>
+      </w:r>
+    </w:p>
+    <w:p>
+      <w:r>
+        <w:t>6. Kembali ke **Kelola tim** sebagai guru → tombol ubah/hapus sekarang **nonaktif** dengan penjelasan bahwa</w:t>
+      </w:r>
+    </w:p>
+    <w:p>
+      <w:r>
+        <w:t xml:space="preserve">   susunan tim dibekukan setelah kuis dikerjakan.</w:t>
       </w:r>
     </w:p>
     <w:sectPr>

</xml_diff>

<commit_message>
Biarkan guru mengunduh nilai satu kuis tanpa menyalin manual
Nilai kini bisa diunduh sebagai CSV berisi nilai tiap soal, hanya dari percobaan
pertama supaya ulangan ulang tidak menyamarkan hasil. Pada kuis mode tim semua
anggota mendapat baris dengan skor tim yang sama, sehingga berkasnya langsung
bisa dipakai sebagai buku nilai. Sel yang mirip rumus spreadsheet diamankan
lebih dulu agar berkasnya tidak berbahaya saat dibuka Excel.

🤖 Generated with Codebuff
Co-Authored-By: Codebuff <noreply@codebuff.com>
</commit_message>
<xml_diff>
--- a/docs/word/catatan-demo.docx
+++ b/docs/word/catatan-demo.docx
@@ -207,7 +207,7 @@
         <w:pStyle w:val="ListBullet"/>
       </w:pPr>
       <w:r>
-        <w:t>**Slice 08**: unggah materi, layar guru ke murid, avatar + laporan.</w:t>
+        <w:t>**Slice 08**: unggah materi, avatar + laporan (layar guru ke murid belum).</w:t>
       </w:r>
     </w:p>
     <w:p>
@@ -223,7 +223,25 @@
         <w:pStyle w:val="ListBullet"/>
       </w:pPr>
       <w:r>
-        <w:t>**Slice 10**: cache L1, mode gelap, Octane Swoole, demo dari link deploy VPS.</w:t>
+        <w:t>**Slice 10**: ekspor nilai CSV; cache L1, Octane Swoole, dan demo dari link deploy VPS masih terbuka.</w:t>
+      </w:r>
+    </w:p>
+    <w:p>
+      <w:r/>
+    </w:p>
+    <w:p>
+      <w:r>
+        <w:t>**Catatan status (7 Oktober 2026):** mode gelap, mode tim, penilaian AI, rekam diri, avatar + moderasi, dan</w:t>
+      </w:r>
+    </w:p>
+    <w:p>
+      <w:r>
+        <w:t>ekspor nilai sudah bisa dipakai. Yang belum: cache L1, layar guru ke perangkat murid (SSE), Octane Swoole, dan</w:t>
+      </w:r>
+    </w:p>
+    <w:p>
+      <w:r>
+        <w:t>deploy (menunggu keputusan host).</w:t>
       </w:r>
     </w:p>
     <w:p>
@@ -2054,6 +2072,63 @@
     <w:p>
       <w:r>
         <w:t xml:space="preserve">   susunan tim dibekukan setelah kuis dikerjakan.</w:t>
+      </w:r>
+    </w:p>
+    <w:p>
+      <w:r/>
+    </w:p>
+    <w:p>
+      <w:pPr>
+        <w:pStyle w:val="Heading3"/>
+      </w:pPr>
+      <w:r>
+        <w:t>Langkah demo (guru) — mengunduh nilai untuk buku nilai</w:t>
+      </w:r>
+    </w:p>
+    <w:p>
+      <w:r>
+        <w:t>1. Dari detail kuis, tekan **Unduh nilai (CSV)**: berkasnya langsung terunduh.</w:t>
+      </w:r>
+    </w:p>
+    <w:p>
+      <w:r>
+        <w:t>2. Buka di Excel/Google Sheets. Sebutkan tiga hal: hanya skor **asli** yang masuk, ada kolom nilai **per soal**,</w:t>
+      </w:r>
+    </w:p>
+    <w:p>
+      <w:r>
+        <w:t xml:space="preserve">   dan pada kuis mode tim semua anggota dapat baris dengan skor tim yang sama.</w:t>
+      </w:r>
+    </w:p>
+    <w:p>
+      <w:r>
+        <w:t>3. Untuk menunjukkan pengaman: ganti nama seorang murid menjadi `=SUM(1+1)` lewat menu **Data Murid**, unduh</w:t>
+      </w:r>
+    </w:p>
+    <w:p>
+      <w:r>
+        <w:t xml:space="preserve">   ulang, dan tunjukkan selnya diawali kutip tunggal (tidak dieksekusi sebagai rumus).</w:t>
+      </w:r>
+    </w:p>
+    <w:p>
+      <w:r/>
+    </w:p>
+    <w:p>
+      <w:pPr>
+        <w:pStyle w:val="Heading3"/>
+      </w:pPr>
+      <w:r>
+        <w:t>Mode gelap</w:t>
+      </w:r>
+    </w:p>
+    <w:p>
+      <w:r>
+        <w:t>Tombol bulan/matahari di bilah atas mengganti terang ↔ gelap untuk seluruh halaman. Tunjukkan bahwa pilihan</w:t>
+      </w:r>
+    </w:p>
+    <w:p>
+      <w:r>
+        <w:t>bertahan setelah halaman dimuat ulang, dan bahwa penanda benar/salah tetap punya ikon di mode gelap.</w:t>
       </w:r>
     </w:p>
     <w:sectPr>

</xml_diff>

<commit_message>
Tambahkan salinan sementara berlapis agar ulangan serempak tidak menekan database
Saat semua murid membuka ulangan di menit yang sama, pembacaan pengaturan yang
sama datang berulang-ulang. Salinan sementara di SQLite tmpfs baru menyala kalau
satu ruang dibaca lebih dari 10 kali per detik dan langsung dibuang setelah reda,
jadi RAM tidak dipakai untuk data yang tidak sedang panas. Setiap salinan membawa
penanda versi: begitu guru mengubah pengaturan, versi naik lebih dulu lalu Redis
dan L1 dibuang berurutan, sehingga tidak mungkin ada kelas yang memakai aturan basi.

🤖 Generated with Codebuff
Co-Authored-By: Codebuff <noreply@codebuff.com>
</commit_message>
<xml_diff>
--- a/docs/word/catatan-demo.docx
+++ b/docs/word/catatan-demo.docx
@@ -231,17 +231,17 @@
     </w:p>
     <w:p>
       <w:r>
-        <w:t>**Catatan status (7 Oktober 2026):** mode gelap, mode tim, penilaian AI, rekam diri, avatar + moderasi, dan</w:t>
-      </w:r>
-    </w:p>
-    <w:p>
-      <w:r>
-        <w:t>ekspor nilai sudah bisa dipakai. Yang belum: cache L1, layar guru ke perangkat murid (SSE), Octane Swoole, dan</w:t>
-      </w:r>
-    </w:p>
-    <w:p>
-      <w:r>
-        <w:t>deploy (menunggu keputusan host).</w:t>
+        <w:t>**Catatan status (7 Oktober 2026):** mode gelap, mode tim, penilaian AI, rekam diri, avatar + moderasi, ekspor</w:t>
+      </w:r>
+    </w:p>
+    <w:p>
+      <w:r>
+        <w:t>nilai, dan cache berlapis L1 sudah bisa dipakai. Yang belum: layar guru ke perangkat murid (SSE), Octane</w:t>
+      </w:r>
+    </w:p>
+    <w:p>
+      <w:r>
+        <w:t>Swoole, dan deploy (menunggu keputusan host).</w:t>
       </w:r>
     </w:p>
     <w:p>
@@ -2129,6 +2129,47 @@
     <w:p>
       <w:r>
         <w:t>bertahan setelah halaman dimuat ulang, dan bahwa penanda benar/salah tetap punya ikon di mode gelap.</w:t>
+      </w:r>
+    </w:p>
+    <w:p>
+      <w:r/>
+    </w:p>
+    <w:p>
+      <w:pPr>
+        <w:pStyle w:val="Heading3"/>
+      </w:pPr>
+      <w:r>
+        <w:t>Cache berlapis (bagian teknis, tidak ada tombol di layar)</w:t>
+      </w:r>
+    </w:p>
+    <w:p>
+      <w:r>
+        <w:t>Bawaannya mati. Untuk mendemokannya dengan jujur: nyalakan `CACHE_L1_AKTIF=true` di `.env`, buka ulangan</w:t>
+      </w:r>
+    </w:p>
+    <w:p>
+      <w:r>
+        <w:t>bersamaan dari beberapa tab/perangkat sampai pengaturan kuis dibaca lebih dari 10 kali per detik, lalu</w:t>
+      </w:r>
+    </w:p>
+    <w:p>
+      <w:r>
+        <w:t>sebutkan tiga hal: berkas salinan muncul di `/dev/shm/ulangan-l1.sqlite`, salinan itu **dibuang lagi** setelah</w:t>
+      </w:r>
+    </w:p>
+    <w:p>
+      <w:r>
+        <w:t>lalu lintas reda, dan saat guru mengubah pengaturan di tengah ulangan, kelas langsung memakai aturan baru</w:t>
+      </w:r>
+    </w:p>
+    <w:p>
+      <w:r>
+        <w:t>(versi naik, salinan lama ditolak). Kalau tidak ada waktu mendemokan beban, cukup tunjukkan test-nya:</w:t>
+      </w:r>
+    </w:p>
+    <w:p>
+      <w:r>
+        <w:t>`php artisan test --filter=Slice10CacheTest`.</w:t>
       </w:r>
     </w:p>
     <w:sectPr>

</xml_diff>

<commit_message>
Bawa layar kelas sampai ke perangkat murid agar guru tak perlu berteriak membagikan soal
Slice 10 terakhir dari daftar potong: guru mengendalikan satu keadaan layar per
kuis (pengumuman, sorot soal, instruksi setelah ulangan) dan perangkat murid
mengikutinya lewat kanal kuis yang sama dengan Live Monitor, dengan polling
sebagai jalur cadangan supaya ulangan tidak pernah berhenti karena realtime mati.
Kunci jawaban sengaja tidak pernah ikut payload, dan murid kelas lain ditolak.

🤖 Generated with Codebuff
Co-Authored-By: Codebuff <noreply@codebuff.com>
</commit_message>
<xml_diff>
--- a/docs/word/catatan-demo.docx
+++ b/docs/word/catatan-demo.docx
@@ -2170,6 +2170,217 @@
     <w:p>
       <w:r>
         <w:t>`php artisan test --filter=Slice10CacheTest`.</w:t>
+      </w:r>
+    </w:p>
+    <w:p>
+      <w:r/>
+    </w:p>
+    <w:p>
+      <w:pPr>
+        <w:pStyle w:val="Heading2"/>
+      </w:pPr>
+      <w:r>
+        <w:t>Demo Slice 10 — Layar Kelas (guru → perangkat murid)</w:t>
+      </w:r>
+    </w:p>
+    <w:p>
+      <w:r/>
+    </w:p>
+    <w:p>
+      <w:r>
+        <w:t>Fitur: guru menampilkan satu keadaan konten di seluruh perangkat murid kelas — pengumuman, satu soal yang</w:t>
+      </w:r>
+    </w:p>
+    <w:p>
+      <w:r>
+        <w:t>disorot, atau instruksi setelah ulangan — tanpa salinan layar, tanpa kunci jawaban, dan tanpa memuat ulang</w:t>
+      </w:r>
+    </w:p>
+    <w:p>
+      <w:r>
+        <w:t>halaman di perangkat murid.</w:t>
+      </w:r>
+    </w:p>
+    <w:p>
+      <w:r/>
+    </w:p>
+    <w:p>
+      <w:pPr>
+        <w:pStyle w:val="Heading3"/>
+      </w:pPr>
+      <w:r>
+        <w:t>Langkah demo (guru) — mengendalikan layar kelas</w:t>
+      </w:r>
+    </w:p>
+    <w:p>
+      <w:r/>
+    </w:p>
+    <w:p>
+      <w:r>
+        <w:t>1. Masuk sebagai guru, buka detail kuis yang sedang berjalan, tekan tombol **Layar kelas**.</w:t>
+      </w:r>
+    </w:p>
+    <w:p>
+      <w:r>
+        <w:t>2. Pilih mode **Sorot satu soal**, pilih salah satu soal dari daftar (ada cuplikan teksnya), tekan</w:t>
+      </w:r>
+    </w:p>
+    <w:p>
+      <w:r>
+        <w:t xml:space="preserve">   **Tampilkan di perangkat murid**. Lencana "Keadaan sekarang" bertambah `versi`-nya.</w:t>
+      </w:r>
+    </w:p>
+    <w:p>
+      <w:r>
+        <w:t>3. Ganti ke **Pengumuman singkat**, tulis "Sisa waktu 10 menit" (boleh dua baris), simpan lagi — murid melihat</w:t>
+      </w:r>
+    </w:p>
+    <w:p>
+      <w:r>
+        <w:t xml:space="preserve">   banner pengumuman tanpa kehilangan jawaban yang sedang ditulis.</w:t>
+      </w:r>
+    </w:p>
+    <w:p>
+      <w:r>
+        <w:t>4. Tekan **Kosongkan layar** — semua perangkat kembali ke tampilan ulangan biasa.</w:t>
+      </w:r>
+    </w:p>
+    <w:p>
+      <w:r/>
+    </w:p>
+    <w:p>
+      <w:pPr>
+        <w:pStyle w:val="Heading3"/>
+      </w:pPr>
+      <w:r>
+        <w:t>Langkah demo (murid) — mengikuti guru</w:t>
+      </w:r>
+    </w:p>
+    <w:p>
+      <w:r/>
+    </w:p>
+    <w:p>
+      <w:r>
+        <w:t>1. Masuk sebagai murid kelas yang sama di tab/perangkat lain, buka kuis yang sama lewat **Kerjakan sekarang**.</w:t>
+      </w:r>
+    </w:p>
+    <w:p>
+      <w:r>
+        <w:t>2. Saat guru menekan tombol, panel "Guru menyorot soal nomor N" muncul di atas daftar soal dalam hitungan</w:t>
+      </w:r>
+    </w:p>
+    <w:p>
+      <w:r>
+        <w:t xml:space="preserve">   detik (SSE). Matikan service realtime untuk menunjukkan jalur cadangan: panel tetap menyusul lewat</w:t>
+      </w:r>
+    </w:p>
+    <w:p>
+      <w:r>
+        <w:t xml:space="preserve">   pembaruan berkala 5 detik — ulangan tidak pernah berhenti karena layar kelas.</w:t>
+      </w:r>
+    </w:p>
+    <w:p>
+      <w:r>
+        <w:t>3. Tunjukkan bahwa soal yang disorot **tidak membawa kunci jawaban** dan jawaban murid tidak berubah oleh</w:t>
+      </w:r>
+    </w:p>
+    <w:p>
+      <w:r>
+        <w:t xml:space="preserve">   panel (panel hanya menampilkan, bukan menimpa lembar jawaban).</w:t>
+      </w:r>
+    </w:p>
+    <w:p>
+      <w:r/>
+    </w:p>
+    <w:p>
+      <w:pPr>
+        <w:pStyle w:val="Heading3"/>
+      </w:pPr>
+      <w:r>
+        <w:t>Bukti lewat API (curl)</w:t>
+      </w:r>
+    </w:p>
+    <w:p>
+      <w:r/>
+    </w:p>
+    <w:p>
+      <w:r>
+        <w:t># Guru mengubah layar; respons membawa versi + keadaan terbaru</w:t>
+      </w:r>
+    </w:p>
+    <w:p>
+      <w:r>
+        <w:t>curl -b cookie-guru.txt -X PUT http://localhost:8000/api/v1/kuis/1/layar \</w:t>
+      </w:r>
+    </w:p>
+    <w:p>
+      <w:r>
+        <w:t xml:space="preserve">  -H 'Accept: application/json' -d '{"mode":"pengumuman","judul":"Sisa waktu 10 menit"}'</w:t>
+      </w:r>
+    </w:p>
+    <w:p>
+      <w:r/>
+    </w:p>
+    <w:p>
+      <w:r>
+        <w:t># Murid kelas itu membaca keadaan yang sama (tanpa daftar soal/bahan pengendali)</w:t>
+      </w:r>
+    </w:p>
+    <w:p>
+      <w:r>
+        <w:t>curl -b cookie-murid.txt http://localhost:8000/api/v1/kuis/1/layar</w:t>
+      </w:r>
+    </w:p>
+    <w:p>
+      <w:r/>
+    </w:p>
+    <w:p>
+      <w:r>
+        <w:t># Murid kelas lain ditolak 403; begitu pula saat saklar layar_guru dimatikan</w:t>
+      </w:r>
+    </w:p>
+    <w:p>
+      <w:r>
+        <w:t>curl -b cookie-murid-lain.txt http://localhost:8000/api/v1/kuis/1/layar   # 403</w:t>
+      </w:r>
+    </w:p>
+    <w:p>
+      <w:r/>
+    </w:p>
+    <w:p>
+      <w:pPr>
+        <w:pStyle w:val="Heading3"/>
+      </w:pPr>
+      <w:r>
+        <w:t>Bukti otomatis</w:t>
+      </w:r>
+    </w:p>
+    <w:p>
+      <w:r/>
+    </w:p>
+    <w:p>
+      <w:r>
+        <w:t>`php artisan test --filter=Slice10LayarTest` (6 test / 70 assertion) dan</w:t>
+      </w:r>
+    </w:p>
+    <w:p>
+      <w:r>
+        <w:t>`npx vitest run src/__tests__/sections/presence/layar.test.js src/__tests__/shared/api/realtime.test.js`</w:t>
+      </w:r>
+    </w:p>
+    <w:p>
+      <w:r>
+        <w:t>(11 test). Yang diuji lewat test, bukan hanya dijelaskan: kunci jawaban tidak pernah ikut terkirim, murid</w:t>
+      </w:r>
+    </w:p>
+    <w:p>
+      <w:r>
+        <w:t>kelas lain 403, saklar `layar_guru` mematikan jalur guru dan menyembunyikan layar dari murid, tiket SSE murid</w:t>
+      </w:r>
+    </w:p>
+    <w:p>
+      <w:r>
+        <w:t>sekali pakai, dan setiap perubahan naik versi + disiarkan ke kanal kuis.</w:t>
       </w:r>
     </w:p>
     <w:sectPr>

</xml_diff>